<commit_message>
docs: business-focused title + cost/quality arc for ISI-4025 brief
Drop 'Beyond the Honeymoon' per board feedback; reframe around observability
cost control (cardinality, PII redaction, tail sampling), cost allocation,
and telemetry quality gates (Weaver + GitHub Actions). App is the vehicle.

Co-Authored-By: Claude Opus 4.8 <noreply@anthropic.com>
Co-Authored-By: Paperclip <noreply@paperclip.ing>
</commit_message>
<xml_diff>
--- a/docs/Perform-Session-Outline-Brief-for-Board.docx
+++ b/docs/Perform-Session-Outline-Brief-for-Board.docx
@@ -16,12 +16,17 @@
           <w:b/>
           <w:sz w:val="26"/>
         </w:rPr>
-        <w:t>Beyond the Honeymoon: OpenTelemetry in Practice — 3-hour hands-on training</w:t>
+        <w:t>Production-Grade OpenTelemetry: Controlling the Cost and Quality of Observability</w:t>
       </w:r>
     </w:p>
     <w:p>
       <w:r>
-        <w:t>Dynatrace Perform 2026 (Hotday) · Prepared for board review</w:t>
+        <w:t>Alt: Observability You Can Afford — Cost, Control &amp; Quality with OpenTelemetry and Dynatrace</w:t>
+      </w:r>
+    </w:p>
+    <w:p>
+      <w:r>
+        <w:t>Dynatrace Perform 2026 (Hotday) · 3-hour hands-on lab · Prepared for board review</w:t>
       </w:r>
     </w:p>
     <w:p>
@@ -74,7 +79,12 @@
     </w:p>
     <w:p>
       <w:r>
-        <w:t>A 3-hour, hands-on Perform lab where attendees take a deliberately broken microservices application (the Vegas Casino from the open-source Perform-Hackathon-2026) from broken telemetry to a production-grade OpenTelemetry pipeline — SDK config first, collector second — with every fix landing live in Dynatrace.</w:t>
+        <w:t>A 3-hour, hands-on Perform lab where attendees take a real microservices application from broken, expensive, ungoverned telemetry to a production-grade OpenTelemetry pipeline — fixing it, then controlling its cost (metric cardinality, log PII, trace sampling), allocating and detecting abnormal ingestion cost, and finally guarding telemetry quality on every release. Every step lands live in Dynatrace, configured through BindPlane.</w:t>
+      </w:r>
+    </w:p>
+    <w:p>
+      <w:r>
+        <w:t>The application (the public Vegas Casino from Perform-Hackathon-2026) is the vehicle — what matters is the content: the cost, control, and quality practices every enterprise needs.</w:t>
       </w:r>
     </w:p>
     <w:p>
@@ -82,7 +92,7 @@
         <w:pStyle w:val="Heading1"/>
       </w:pPr>
       <w:r>
-        <w:t>2. Why this session (value to Dynatrace &amp; Perform)</w:t>
+        <w:t>2. Why this session (business value)</w:t>
       </w:r>
     </w:p>
     <w:p>
@@ -90,7 +100,7 @@
         <w:pStyle w:val="ListBullet"/>
       </w:pPr>
       <w:r>
-        <w:t>Positions Dynatrace as the OpenTelemetry authority — vendor-neutral OTel done right, with Dynatrace as the destination that just works. Strongest proof point for our "open by default" story.</w:t>
+        <w:t>Observability cost is a board-level line item. Attendees leave able to cut ingestion cost without losing signal — cardinality control, PII-safe logs, and tail sampling are direct, measurable savings.</w:t>
       </w:r>
     </w:p>
     <w:p>
@@ -98,7 +108,7 @@
         <w:pStyle w:val="ListBullet"/>
       </w:pPr>
       <w:r>
-        <w:t>Meets the audience where the pain is: config sprawl, runaway cost, dropped traces. Sells the operational maturity they lack — and BindPlane + Dynatrace as the answer.</w:t>
+        <w:t>Data governance &amp; compliance: redacting PII in logs at the collector is a concrete risk reduction attendees take home Monday.</w:t>
       </w:r>
     </w:p>
     <w:p>
@@ -106,7 +116,7 @@
         <w:pStyle w:val="ListBullet"/>
       </w:pPr>
       <w:r>
-        <w:t>Reusable asset: built on the upcoming book "Beyond the Honeymoon: OTel at Enterprise Scale" and a public GitHub app; the lab lives on as enablement content after Perform.</w:t>
+        <w:t>Reliability of the observability itself: bad or regressed telemetry breaks incident response; quality gates (Weaver + CI) make observability trustworthy release over release.</w:t>
       </w:r>
     </w:p>
     <w:p>
@@ -114,7 +124,15 @@
         <w:pStyle w:val="ListBullet"/>
       </w:pPr>
       <w:r>
-        <w:t>Grounded in real facilitators’ field experience, not slideware.</w:t>
+        <w:t>Positions Dynatrace as the OpenTelemetry authority — vendor-neutral OTel done right, with Dynatrace + BindPlane making cost and quality manageable.</w:t>
+      </w:r>
+    </w:p>
+    <w:p>
+      <w:pPr>
+        <w:pStyle w:val="ListBullet"/>
+      </w:pPr>
+      <w:r>
+        <w:t>Reusable enablement asset after Perform, grounded in the facilitators’ field experience.</w:t>
       </w:r>
     </w:p>
     <w:p>
@@ -205,7 +223,7 @@
           </w:tcPr>
           <w:p>
             <w:r>
-              <w:t>GitHub Codespace — kind cluster, casino app, Dynatrace tenant, BindPlane. No local setup</w:t>
+              <w:t>GitHub Codespace — kind cluster, sample app, Dynatrace tenant, BindPlane. No local setup</w:t>
             </w:r>
           </w:p>
         </w:tc>
@@ -245,7 +263,7 @@
               <w:rPr>
                 <w:b/>
               </w:rPr>
-              <w:t>Application</w:t>
+              <w:t>Application (vehicle)</w:t>
             </w:r>
           </w:p>
         </w:tc>
@@ -255,7 +273,7 @@
           </w:tcPr>
           <w:p>
             <w:r>
-              <w:t>Vegas Casino (Perform-Hackathon-2026) — decision settled with Adam</w:t>
+              <w:t>Vegas Casino (Perform-Hackathon-2026), shipped deliberately broken</w:t>
             </w:r>
           </w:p>
         </w:tc>
@@ -280,7 +298,7 @@
           </w:tcPr>
           <w:p>
             <w:r>
-              <w:t>OTel SDK declarative config (otel-config.yaml), BindPlane (collector fleet), Dynatrace</w:t>
+              <w:t>OTel SDK declarative config, BindPlane, Weaver, GitHub Actions, Dynatrace</w:t>
             </w:r>
           </w:p>
         </w:tc>
@@ -316,12 +334,7 @@
         <w:pStyle w:val="Heading1"/>
       </w:pPr>
       <w:r>
-        <w:t>4. Outline — baseline session (no attendee AI licenses required)</w:t>
-      </w:r>
-    </w:p>
-    <w:p>
-      <w:r>
-        <w:t>The casino ships broken on purpose. Attendees diagnose, fix, and operate it in five moves, each ending with a visible win in Dynatrace.</w:t>
+        <w:t>4. Outline — the arc: Fix -&gt; Control cost -&gt; Govern quality</w:t>
       </w:r>
     </w:p>
     <w:tbl>
@@ -371,7 +384,7 @@
               <w:rPr>
                 <w:b/>
               </w:rPr>
-              <w:t>What they do</w:t>
+              <w:t>What attendees do</w:t>
             </w:r>
           </w:p>
         </w:tc>
@@ -393,7 +406,7 @@
           </w:tcPr>
           <w:p>
             <w:r>
-              <w:t>M0 — The Honeymoon Problem</w:t>
+              <w:t>M0 — Why cost &amp; quality decide observability’s future</w:t>
             </w:r>
           </w:p>
         </w:tc>
@@ -403,7 +416,7 @@
           </w:tcPr>
           <w:p>
             <w:r>
-              <w:t>Framing + Codespace/env check</w:t>
+              <w:t>Business framing + Codespace/env check</w:t>
             </w:r>
           </w:p>
         </w:tc>
@@ -415,7 +428,7 @@
           </w:tcPr>
           <w:p>
             <w:r>
-              <w:t>0:15–0:45</w:t>
+              <w:t>0:15–0:50</w:t>
             </w:r>
           </w:p>
         </w:tc>
@@ -425,7 +438,7 @@
           </w:tcPr>
           <w:p>
             <w:r>
-              <w:t>M1 — Tour the broken casino</w:t>
+              <w:t>M1 — Fix the broken pipeline (SDK first)</w:t>
             </w:r>
           </w:p>
         </w:tc>
@@ -435,7 +448,7 @@
           </w:tcPr>
           <w:p>
             <w:r>
-              <w:t>OTel core principles; hunt planted defects (broken propagation, unknown_service, missing logs)</w:t>
+              <w:t>OTel core principles; fix declarative SDK config so telemetry flows correctly into Dynatrace</w:t>
             </w:r>
           </w:p>
         </w:tc>
@@ -447,7 +460,7 @@
           </w:tcPr>
           <w:p>
             <w:r>
-              <w:t>0:45–1:15</w:t>
+              <w:t>0:50–1:20</w:t>
             </w:r>
           </w:p>
         </w:tc>
@@ -457,7 +470,7 @@
           </w:tcPr>
           <w:p>
             <w:r>
-              <w:t>M2 — SDK config by file</w:t>
+              <w:t>M2 — The collector as control point (BindPlane)</w:t>
             </w:r>
           </w:p>
         </w:tc>
@@ -467,7 +480,7 @@
           </w:tcPr>
           <w:p>
             <w:r>
-              <w:t>Fix declarative otel-config.yaml: resource, propagators, samplers, batch, OTLP exporters</w:t>
+              <w:t>Build/fix the collector pipeline the simple way with BindPlane</w:t>
             </w:r>
           </w:p>
         </w:tc>
@@ -479,7 +492,7 @@
           </w:tcPr>
           <w:p>
             <w:r>
-              <w:t>1:15–1:25</w:t>
+              <w:t>1:20–1:30</w:t>
             </w:r>
           </w:p>
         </w:tc>
@@ -509,7 +522,7 @@
           </w:tcPr>
           <w:p>
             <w:r>
-              <w:t>1:25–2:05</w:t>
+              <w:t>1:30–2:15</w:t>
             </w:r>
           </w:p>
         </w:tc>
@@ -519,7 +532,7 @@
           </w:tcPr>
           <w:p>
             <w:r>
-              <w:t>M3 — Collector as control point (BindPlane)</w:t>
+              <w:t>M3 — Control the cost of observability (centerpiece)</w:t>
             </w:r>
           </w:p>
         </w:tc>
@@ -529,7 +542,7 @@
           </w:tcPr>
           <w:p>
             <w:r>
-              <w:t>Fix processor order + memory_limiter, add routing/enrichment, staged rollout — centerpiece</w:t>
+              <w:t>Metrics: tame insane cardinality · Logs: redact PII at the collector · Traces: tail-sampling strategy</w:t>
             </w:r>
           </w:p>
         </w:tc>
@@ -541,7 +554,7 @@
           </w:tcPr>
           <w:p>
             <w:r>
-              <w:t>2:05–2:35</w:t>
+              <w:t>2:15–2:35</w:t>
             </w:r>
           </w:p>
         </w:tc>
@@ -551,7 +564,7 @@
           </w:tcPr>
           <w:p>
             <w:r>
-              <w:t>M4 — Sampling as a strategy</w:t>
+              <w:t>M4 — Measure &amp; allocate the bill</w:t>
             </w:r>
           </w:p>
         </w:tc>
@@ -561,7 +574,7 @@
           </w:tcPr>
           <w:p>
             <w:r>
-              <w:t>Head vs. tail sampling, spanmetrics; defend the cost/fidelity trade-off</w:t>
+              <w:t>Cost allocation to measure ingestion and detect abnormal cost spikes</w:t>
             </w:r>
           </w:p>
         </w:tc>
@@ -573,7 +586,7 @@
           </w:tcPr>
           <w:p>
             <w:r>
-              <w:t>2:35–3:00</w:t>
+              <w:t>2:35–2:57</w:t>
             </w:r>
           </w:p>
         </w:tc>
@@ -583,7 +596,7 @@
           </w:tcPr>
           <w:p>
             <w:r>
-              <w:t>M5 — Operate at scale + readiness checklist</w:t>
+              <w:t>M5 — Guard telemetry quality on every release</w:t>
             </w:r>
           </w:p>
         </w:tc>
@@ -593,15 +606,45 @@
           </w:tcPr>
           <w:p>
             <w:r>
-              <w:t>Fleet ops, config safety, Q&amp;A</w:t>
+              <w:t>Weaver for semantic conventions + GitHub Actions reporting observability quality / regressions per release</w:t>
             </w:r>
+          </w:p>
+        </w:tc>
+      </w:tr>
+      <w:tr>
+        <w:tc>
+          <w:tcPr>
+            <w:tcW w:type="dxa" w:w="2880"/>
+          </w:tcPr>
+          <w:p>
+            <w:r>
+              <w:t>2:57–3:00</w:t>
+            </w:r>
+          </w:p>
+        </w:tc>
+        <w:tc>
+          <w:tcPr>
+            <w:tcW w:type="dxa" w:w="2880"/>
+          </w:tcPr>
+          <w:p>
+            <w:r>
+              <w:t>Close &amp; survey</w:t>
+            </w:r>
+          </w:p>
+        </w:tc>
+        <w:tc>
+          <w:tcPr>
+            <w:tcW w:type="dxa" w:w="2880"/>
+          </w:tcPr>
+          <w:p>
+            <w:r/>
           </w:p>
         </w:tc>
       </w:tr>
     </w:tbl>
     <w:p>
       <w:r>
-        <w:t>Takeaways: attendees leave with the lab repo, working configs they wrote themselves, and a mental model of what "production-grade OTel" actually means.</w:t>
+        <w:t>Takeaways: attendees leave with the lab repo, working configs they wrote themselves, and a repeatable playbook for cheaper, safer, higher-quality observability — not just "OTel that works."</w:t>
       </w:r>
     </w:p>
     <w:p>
@@ -614,7 +657,7 @@
     </w:p>
     <w:p>
       <w:r>
-        <w:t>This is the open question the board is asked to weigh in on. Securing GitHub Copilot (or equivalent AI-agent) licenses for attendees during the session changes what we can deliver.</w:t>
+        <w:t>This is the open question for the board. The content above is deliberately ambitious for 180 minutes; AI-agent licenses are what let us cover all of it at depth.</w:t>
       </w:r>
     </w:p>
     <w:tbl>
@@ -675,7 +718,7 @@
           </w:tcPr>
           <w:p>
             <w:r>
-              <w:t>Scope</w:t>
+              <w:t>Coverage</w:t>
             </w:r>
           </w:p>
         </w:tc>
@@ -685,7 +728,7 @@
           </w:tcPr>
           <w:p>
             <w:r>
-              <w:t>5 modules, guided fixes</w:t>
+              <w:t>Fix + collector + cost control; quality-gates as guided demo</w:t>
             </w:r>
           </w:p>
         </w:tc>
@@ -695,7 +738,7 @@
           </w:tcPr>
           <w:p>
             <w:r>
-              <w:t>Same spine + deeper, open-ended labs</w:t>
+              <w:t>Full arc hands-on incl. Weaver + CI quality gates per attendee</w:t>
             </w:r>
           </w:p>
         </w:tc>
@@ -739,38 +782,6 @@
           </w:tcPr>
           <w:p>
             <w:r>
-              <w:t>Added topics</w:t>
-            </w:r>
-          </w:p>
-        </w:tc>
-        <w:tc>
-          <w:tcPr>
-            <w:tcW w:type="dxa" w:w="2880"/>
-          </w:tcPr>
-          <w:p>
-            <w:r>
-              <w:t>—</w:t>
-            </w:r>
-          </w:p>
-        </w:tc>
-        <w:tc>
-          <w:tcPr>
-            <w:tcW w:type="dxa" w:w="2880"/>
-          </w:tcPr>
-          <w:p>
-            <w:r>
-              <w:t>SemConv + Weaver, taming hostile/unstructured sources (XML, non-friendly logs), custom collector components, richer sampling design</w:t>
-            </w:r>
-          </w:p>
-        </w:tc>
-      </w:tr>
-      <w:tr>
-        <w:tc>
-          <w:tcPr>
-            <w:tcW w:type="dxa" w:w="2880"/>
-          </w:tcPr>
-          <w:p>
-            <w:r>
               <w:t>Throughput</w:t>
             </w:r>
           </w:p>
@@ -791,7 +802,7 @@
           </w:tcPr>
           <w:p>
             <w:r>
-              <w:t>Agents absorb boilerplate → more ground covered in 180 min</w:t>
+              <w:t>Agents absorb boilerplate → the fuller cost + governance content fits in 180 min</w:t>
             </w:r>
           </w:p>
         </w:tc>
@@ -869,7 +880,7 @@
         <w:t xml:space="preserve">Recommendation: </w:t>
       </w:r>
       <w:r>
-        <w:t>design the session so the baseline is fully self-sufficient, and treat AI agents as an additive layer — if licenses land, we switch on the deeper track; if not, the session still delivers in full. A yes raises the ceiling; a no costs us nothing.</w:t>
+        <w:t>design the baseline to be fully self-sufficient and treat AI agents as an additive layer that unlocks the deeper cost + quality content. A yes raises the ceiling; a no costs us nothing.</w:t>
       </w:r>
     </w:p>
     <w:p>
@@ -917,7 +928,7 @@
         <w:pStyle w:val="ListBullet"/>
       </w:pPr>
       <w:r>
-        <w:t>Application choice (casino) — settled with Adam.</w:t>
+        <w:t>Title reworked to a business framing (cost + quality); "Beyond the Honeymoon" dropped per board feedback.</w:t>
       </w:r>
     </w:p>
     <w:p>
@@ -925,7 +936,23 @@
         <w:pStyle w:val="ListBullet"/>
       </w:pPr>
       <w:r>
-        <w:t>Detailed structure, agenda, and planted-defect inventory — drafted (training-structure.md), validated against the real app (ISI-4030).</w:t>
+        <w:t>Content arc expanded per Henrik: cost control (cardinality, PII, tail sampling), cost allocation, and telemetry quality gates (Weaver + GitHub Actions).</w:t>
+      </w:r>
+    </w:p>
+    <w:p>
+      <w:pPr>
+        <w:pStyle w:val="ListBullet"/>
+      </w:pPr>
+      <w:r>
+        <w:t>Application choice (casino, as vehicle) — settled with Adam.</w:t>
+      </w:r>
+    </w:p>
+    <w:p>
+      <w:pPr>
+        <w:pStyle w:val="ListBullet"/>
+      </w:pPr>
+      <w:r>
+        <w:t>Detailed structure + planted-defect inventory — drafted (training-structure.md), to be extended for the new cost/quality modules.</w:t>
       </w:r>
     </w:p>
     <w:p>
@@ -934,14 +961,6 @@
       </w:pPr>
       <w:r>
         <w:t>Blocking only the AI-augmented track: the licensing decision above.</w:t>
-      </w:r>
-    </w:p>
-    <w:p>
-      <w:pPr>
-        <w:pStyle w:val="ListBullet"/>
-      </w:pPr>
-      <w:r>
-        <w:t>On a yes, next step is to spec the AI-augmented lab extensions as child stories.</w:t>
       </w:r>
     </w:p>
     <w:sectPr>

</xml_diff>

<commit_message>
docs: add 3-act narrative outline before detailed agenda (ISI-4025)
Per board feedback: short 'simple journey until cost explosion + PII leaks'
framing and Fix -> Control cost -> Govern quality acts, ahead of the detailed
module table. Regenerated the board docx.

Co-Authored-By: Claude Opus 4.8 <noreply@anthropic.com>
Co-Authored-By: Paperclip <noreply@paperclip.ing>
</commit_message>
<xml_diff>
--- a/docs/Perform-Session-Outline-Brief-for-Board.docx
+++ b/docs/Perform-Session-Outline-Brief-for-Board.docx
@@ -66,7 +66,7 @@
         <w:t xml:space="preserve">Status: </w:t>
       </w:r>
       <w:r>
-        <w:t>structure approved internally (Henrik + Adam); one board decision pending (§5)</w:t>
+        <w:t>structure approved internally (Henrik + Adam); one board decision pending (§6)</w:t>
       </w:r>
     </w:p>
     <w:p>
@@ -92,7 +92,54 @@
         <w:pStyle w:val="Heading1"/>
       </w:pPr>
       <w:r>
-        <w:t>2. Why this session (business value)</w:t>
+        <w:t>2. The story in short (read before the detailed agenda)</w:t>
+      </w:r>
+    </w:p>
+    <w:p>
+      <w:r>
+        <w:t>OpenTelemetry looks like a simple journey: instrument the app, export the data, watch a dashboard light up. Then reality arrives — the bill explodes, PII leaks into logs, and telemetry quality quietly regresses release after release. The lesson every team learns the hard way: observability isn’t a one-time setup, it’s a discipline. Sustainable observability demands the right process and the right checks.</w:t>
+      </w:r>
+    </w:p>
+    <w:p>
+      <w:r>
+        <w:t>This session walks that full journey in three acts:</w:t>
+      </w:r>
+    </w:p>
+    <w:p>
+      <w:pPr>
+        <w:pStyle w:val="ListNumber"/>
+      </w:pPr>
+      <w:r>
+        <w:t>Act 1 — Fix it. Get telemetry correct: OTel core principles, declarative SDK config, then the collector as the control point — configured simply with BindPlane, landing in Dynatrace.</w:t>
+      </w:r>
+    </w:p>
+    <w:p>
+      <w:pPr>
+        <w:pStyle w:val="ListNumber"/>
+      </w:pPr>
+      <w:r>
+        <w:t>Act 2 — Control the cost. Where the money leaks: tame metric cardinality, redact PII from logs, apply tail sampling, and use cost allocation to catch abnormal ingestion.</w:t>
+      </w:r>
+    </w:p>
+    <w:p>
+      <w:pPr>
+        <w:pStyle w:val="ListNumber"/>
+      </w:pPr>
+      <w:r>
+        <w:t>Act 3 — Govern the quality. Make it stay good: Weaver + GitHub Actions gates that report observability quality and catch regressions on every release.</w:t>
+      </w:r>
+    </w:p>
+    <w:p>
+      <w:r>
+        <w:t>Attendees leave not with "OTel that works," but with a repeatable playbook for observability that is cheaper, safer, and trustworthy over time.</w:t>
+      </w:r>
+    </w:p>
+    <w:p>
+      <w:pPr>
+        <w:pStyle w:val="Heading1"/>
+      </w:pPr>
+      <w:r>
+        <w:t>3. Why this session (business value)</w:t>
       </w:r>
     </w:p>
     <w:p>
@@ -140,7 +187,7 @@
         <w:pStyle w:val="Heading1"/>
       </w:pPr>
       <w:r>
-        <w:t>3. Format at a glance</w:t>
+        <w:t>4. Format at a glance</w:t>
       </w:r>
     </w:p>
     <w:tbl>
@@ -334,7 +381,7 @@
         <w:pStyle w:val="Heading1"/>
       </w:pPr>
       <w:r>
-        <w:t>4. Outline — the arc: Fix -&gt; Control cost -&gt; Govern quality</w:t>
+        <w:t>5. Outline — the arc: Fix -&gt; Control cost -&gt; Govern quality</w:t>
       </w:r>
     </w:p>
     <w:tbl>
@@ -652,7 +699,7 @@
         <w:pStyle w:val="Heading1"/>
       </w:pPr>
       <w:r>
-        <w:t>5. Board decision — AI agents for attendees (Copilot licenses)</w:t>
+        <w:t>6. Board decision — AI agents for attendees (Copilot licenses)</w:t>
       </w:r>
     </w:p>
     <w:p>
@@ -888,7 +935,7 @@
         <w:pStyle w:val="Heading1"/>
       </w:pPr>
       <w:r>
-        <w:t>6. What we need from the board</w:t>
+        <w:t>7. What we need from the board</w:t>
       </w:r>
     </w:p>
     <w:p>
@@ -920,7 +967,7 @@
         <w:pStyle w:val="Heading1"/>
       </w:pPr>
       <w:r>
-        <w:t>7. Status &amp; next steps</w:t>
+        <w:t>8. Status &amp; next steps</w:t>
       </w:r>
     </w:p>
     <w:p>
@@ -936,7 +983,15 @@
         <w:pStyle w:val="ListBullet"/>
       </w:pPr>
       <w:r>
-        <w:t>Content arc expanded per Henrik: cost control (cardinality, PII, tail sampling), cost allocation, and telemetry quality gates (Weaver + GitHub Actions).</w:t>
+        <w:t>Added a short 3-act narrative outline before the detailed agenda (per board feedback).</w:t>
+      </w:r>
+    </w:p>
+    <w:p>
+      <w:pPr>
+        <w:pStyle w:val="ListBullet"/>
+      </w:pPr>
+      <w:r>
+        <w:t>Content arc: cost control (cardinality, PII, tail sampling), cost allocation, and telemetry quality gates (Weaver + GitHub Actions).</w:t>
       </w:r>
     </w:p>
     <w:p>

</xml_diff>